<commit_message>
fix: abstract phrase, word count, TOC typo in thesis
- Rewrite garbled abstract clause to 'a strengthened balance sheet channel'
- Fill in document length (9,637 words)
- Correct TOC entry 'Apeendix 4. Montly' -> 'Appendix 4. Monthly'
</commit_message>
<xml_diff>
--- a/thesis/write/RT_paper2026.docx
+++ b/thesis/write/RT_paper2026.docx
@@ -215,10 +215,7 @@
     <w:p/>
     <w:p>
       <w:r>
-        <w:t>The document length is ……</w:t>
-      </w:r>
-      <w:r>
-        <w:t>…...</w:t>
+        <w:t>The document length is 9,637</w:t>
       </w:r>
       <w:r>
         <w:t xml:space="preserve"> words from the introduction to the end of the conclusion.</w:t>
@@ -3220,7 +3217,7 @@
             <w:noProof/>
             <w:lang w:val="et-EE"/>
           </w:rPr>
-          <w:t>Apeendix 4. Montly Robustness Full OLS Output</w:t>
+          <w:t>Appendix 4. Monthly Robustness Full OLS Output</w:t>
         </w:r>
         <w:r>
           <w:rPr>
@@ -3981,9 +3978,6 @@
         <w:t xml:space="preserve"> that macroeconomic sensitivity increased after the ETF approval, H2 posits that the halving premium diminished. H1 is not supported: the macro interaction terms are statistically insignificant at the weekly frequency, though monthly robustness analysis provides marginal evidence for</w:t>
       </w:r>
       <w:r>
-        <w:t xml:space="preserve"> increased balance sheet effect</w:t>
-      </w:r>
-      <w:r>
         <w:t xml:space="preserve"> a strengthened balance sheet channel. H2 is supported: the halving window coefficient, which is highly significant in the pre-ETF period (+0.030, p = 0.007), collapses to near zero post-ETF. A multi-cryptocurrency panel robustness </w:t>
       </w:r>
       <w:r>
@@ -5834,7 +5828,7 @@
         <w:t xml:space="preserve">which gives </w:t>
       </w:r>
       <w:r>
-        <w:t xml:space="preserve">598 usable weekly observations after dropping the first one, which is used for the lagged Bitcoin return. July 2014 is the earliest point with reliable weekly Bitcoin price data on Yahoo Finance. Earlier data is </w:t>
+        <w:t xml:space="preserve">598 usable weekly observations. The first weeks in July 2014 are dropped to construct lagged returns and first-differences, so the estimation window effectively runs from October 2014 onward. July 2014 is the earliest point with reliable weekly Bitcoin price data on Yahoo Finance. Earlier data is </w:t>
       </w:r>
       <w:r>
         <w:t>insuffic</w:t>
@@ -6167,7 +6161,7 @@
         <w:t xml:space="preserve"> </w:t>
       </w:r>
       <w:r>
-        <w:t>tailed distribution typical of financial returns. Table 2.1 presents descriptive statistics for all variables.</w:t>
+        <w:t>tailed distribution typical of financial returns. Table 2.1 presents descriptive statistics for all variables. Figure 2.1 shows the weekly log-return series over the full sample.</w:t>
       </w:r>
     </w:p>
     <w:p>
@@ -7185,7 +7179,7 @@
         <w:rPr>
           <w:lang w:val="en-US"/>
         </w:rPr>
-        <w:t>Figure 2.3. shows rolling correlation of Bitcoin to S&amp;P500 returns with halvings and ETF adoption overlaid.</w:t>
+        <w:t>Figure 2.3 shows rolling correlation of Bitcoin to S&amp;P500 returns with halvings and ETF adoption overlaid.</w:t>
       </w:r>
     </w:p>
     <w:p>
@@ -9377,7 +9371,7 @@
         <w:t xml:space="preserve">values below 0.10 are typical for macro return </w:t>
       </w:r>
       <w:r>
-        <w:t>regressions.</w:t>
+        <w:t>regressions. Table 3.1 reports the full coefficient estimates.</w:t>
       </w:r>
       <w:r>
         <w:rPr>
@@ -9488,28 +9482,16 @@
         <w:t>which is similar to what has been</w:t>
       </w:r>
       <w:r>
-        <w:t xml:space="preserve"> found by Karau (2023) and Ma et al. (2022). HalvingWindow is positive and significant at the 1% level (+0.030, p = 0.007), meaning that during the 18</w:t>
-      </w:r>
-      <w:r>
-        <w:t xml:space="preserve"> </w:t>
-      </w:r>
-      <w:r>
-        <w:t>months</w:t>
-      </w:r>
-      <w:r>
-        <w:t xml:space="preserve"> </w:t>
-      </w:r>
-      <w:r>
-        <w:t xml:space="preserve">after </w:t>
-      </w:r>
-      <w:r>
-        <w:t xml:space="preserve">halving windows in the pre-ETF period, Bitcoin earned an additional 3.0 percentage points per week on average compared to </w:t>
-      </w:r>
-      <w:r>
-        <w:t>out of the window</w:t>
-      </w:r>
-      <w:r>
-        <w:t xml:space="preserve"> periods, after controlling for macro variables. dFedBS is not significant (coefficient = -0.003, p = 0.424), suggesting that weekly balance sheet changes do not have a detectable relationship with Bitcoin returns at </w:t>
+        <w:t xml:space="preserve"> found by Karau (2023) and Ma et al. (2022). HalvingWindow is positive and significant at the 1% level (+0.030, p = 0.007). In the pre-ETF period, during the 18 month window after each halving, Bitcoin weekly returns were on average 3.0 percentage points higher than in weeks outside those windows, after controlling for macro variables.</w:t>
+      </w:r>
+      <w:r/>
+      <w:r/>
+      <w:r/>
+      <w:r/>
+      <w:r/>
+      <w:r/>
+      <w:r>
+        <w:t xml:space="preserve"> dFedBS is not significant (coefficient = -0.003, p = 0.424), suggesting that weekly balance sheet changes do not have a detectable relationship with Bitcoin returns at </w:t>
       </w:r>
       <w:r>
         <w:t>weekly observations</w:t>
@@ -9713,7 +9695,7 @@
         <w:t xml:space="preserve"> 3.1. </w:t>
       </w:r>
       <w:r>
-        <w:t>Model 1 Full-Sample Interaction Regression Results (n=598).</w:t>
+        <w:t>Model 1 Residuals: Time Series and Distribution.</w:t>
       </w:r>
     </w:p>
     <w:p>
@@ -9803,7 +9785,7 @@
     </w:p>
     <w:p>
       <w:r>
-        <w:t>Model 2 estimates the specification without interaction terms separately on the pre-ETF (n = 484, October 2014 to January 2024) and post-ETF (n = 114, January 2024 to March 2026) sub-samples. The results are presented side by side for comparison</w:t>
+        <w:t>Model 2 estimates the specification without interaction terms separately on the pre-ETF (n = 484, October 2014 to January 2024) and post-ETF (n = 114, January 2024 to March 2026) sub-samples. The results are presented side by side in Table 3.2 for comparison</w:t>
       </w:r>
       <w:r>
         <w:t>.</w:t>
@@ -9880,7 +9862,7 @@
         <w:t xml:space="preserve">. </w:t>
       </w:r>
       <w:r>
-        <w:t>Model 2 Sub-Sample Regression Results: Pre-ETF</w:t>
+        <w:t>Model 2 Sub-Sample Regression Results: Pre-ETF and Post-ETF</w:t>
       </w:r>
       <w:r>
         <w:t>.</w:t>
@@ -10067,7 +10049,7 @@
         <w:t xml:space="preserve"> the F-statistic is 1.118 (p = 0.350), also failing to reject</w:t>
       </w:r>
       <w:r>
-        <w:t>.</w:t>
+        <w:t>. It should be noted that the Chow test evaluates the joint stability of the full coefficient vector, while the interaction terms in Model 1 test whether a single coefficient has shifted between regimes. The two are not equivalent: individual coefficients can move between periods while the joint test still fails to reject, particularly when changes in different coefficients work in opposite directions.</w:t>
       </w:r>
     </w:p>
     <w:p/>
@@ -10222,7 +10204,7 @@
         <w:t>noise through temporal aggregation</w:t>
       </w:r>
       <w:r>
-        <w:t>.</w:t>
+        <w:t>. Table 3.3 reports the monthly estimates.</w:t>
       </w:r>
     </w:p>
     <w:p/>
@@ -10463,8 +10445,7 @@
         <w:t xml:space="preserve"> balance sheet as a liquidity proxy when the literature also highlights M2 (Zhao et al., 2023; Gu et al., 2021; Sarker and Wang, 2022). It is </w:t>
       </w:r>
       <w:r>
-        <w:lastRenderedPageBreak/>
-        <w:t>estimated over 587 observations with HAC standard errors (maxlags=10).</w:t>
+        <w:t>estimated over 587 observations with HAC standard errors (maxlags=10). Full results are in Table 3.4.</w:t>
       </w:r>
       <w:r>
         <w:rPr>
@@ -10767,7 +10748,7 @@
         <w:t>s halving dates for all assets, and PostETF is 10 January 2024 for all</w:t>
       </w:r>
       <w:r>
-        <w:t>.</w:t>
+        <w:t>. Table 3.5 reports the panel estimates.</w:t>
       </w:r>
     </w:p>
     <w:p>
@@ -13404,7 +13385,7 @@
         <w:rPr>
           <w:lang w:val="et-EE"/>
         </w:rPr>
-        <w:t xml:space="preserve">Lyocsa, S., Molnar, P., Plihal, T., &amp; Siranova, M. (2020). Impact of macroeconomic news, regulation and hacking exchange markets on the volatility of Bitcoin. </w:t>
+        <w:t xml:space="preserve">Lyócsa, Š., Molnár, P., Plíhal, T., &amp; Širaňová, M. (2020). Impact of macroeconomic news, regulation and hacking exchange markets on the volatility of Bitcoin. </w:t>
       </w:r>
       <w:r>
         <w:rPr>

</xml_diff>